<commit_message>
Add Figures 2-7 and S1 (prediction benchmark, rewiring, cross-species, drug reversal, L5 triangulation, evidence ladder, PC correction) to manuscript_v6_humanized.docx; include figure-generation and docx-build scripts
</commit_message>
<xml_diff>
--- a/gate1/rewiring_study/manuscript_v6_humanized.docx
+++ b/gate1/rewiring_study/manuscript_v6_humanized.docx
@@ -9673,15 +9673,42 @@
       </w:r>
     </w:p>
     <w:p>
-      <w:r>
-        <w:rPr>
-          <w:rFonts w:ascii="Times New Roman" w:hAnsi="Times New Roman"/>
-          <w:b w:val="0"/>
-          <w:i/>
-          <w:color w:val="808080"/>
-          <w:sz w:val="20"/>
-        </w:rPr>
-        <w:t>[Figure 2 — figure image to be inserted]</w:t>
+      <w:pPr>
+        <w:jc w:val="center"/>
+      </w:pPr>
+      <w:r>
+        <w:drawing>
+          <wp:inline xmlns:a="http://schemas.openxmlformats.org/drawingml/2006/main" xmlns:pic="http://schemas.openxmlformats.org/drawingml/2006/picture">
+            <wp:extent cx="5400000" cy="2519656"/>
+            <wp:docPr id="2" name="Picture 2"/>
+            <wp:cNvGraphicFramePr>
+              <a:graphicFrameLocks noChangeAspect="1"/>
+            </wp:cNvGraphicFramePr>
+            <a:graphic>
+              <a:graphicData uri="http://schemas.openxmlformats.org/drawingml/2006/picture">
+                <pic:pic>
+                  <pic:nvPicPr>
+                    <pic:cNvPr id="0" name="figure2_prediction_benchmark.png"/>
+                    <pic:cNvPicPr/>
+                  </pic:nvPicPr>
+                  <pic:blipFill>
+                    <a:blip r:embed="rId10"/>
+                    <a:stretch>
+                      <a:fillRect/>
+                    </a:stretch>
+                  </pic:blipFill>
+                  <pic:spPr>
+                    <a:xfrm>
+                      <a:off x="0" y="0"/>
+                      <a:ext cx="5400000" cy="2519656"/>
+                    </a:xfrm>
+                    <a:prstGeom prst="rect"/>
+                  </pic:spPr>
+                </pic:pic>
+              </a:graphicData>
+            </a:graphic>
+          </wp:inline>
+        </w:drawing>
       </w:r>
     </w:p>
     <w:p>
@@ -9705,15 +9732,42 @@
       </w:r>
     </w:p>
     <w:p>
-      <w:r>
-        <w:rPr>
-          <w:rFonts w:ascii="Times New Roman" w:hAnsi="Times New Roman"/>
-          <w:b w:val="0"/>
-          <w:i/>
-          <w:color w:val="808080"/>
-          <w:sz w:val="20"/>
-        </w:rPr>
-        <w:t>[Figure 3 — figure image to be inserted]</w:t>
+      <w:pPr>
+        <w:jc w:val="center"/>
+      </w:pPr>
+      <w:r>
+        <w:drawing>
+          <wp:inline xmlns:a="http://schemas.openxmlformats.org/drawingml/2006/main" xmlns:pic="http://schemas.openxmlformats.org/drawingml/2006/picture">
+            <wp:extent cx="5400000" cy="4951585"/>
+            <wp:docPr id="3" name="Picture 3"/>
+            <wp:cNvGraphicFramePr>
+              <a:graphicFrameLocks noChangeAspect="1"/>
+            </wp:cNvGraphicFramePr>
+            <a:graphic>
+              <a:graphicData uri="http://schemas.openxmlformats.org/drawingml/2006/picture">
+                <pic:pic>
+                  <pic:nvPicPr>
+                    <pic:cNvPr id="0" name="figure3_rewiring_heatmaps.png"/>
+                    <pic:cNvPicPr/>
+                  </pic:nvPicPr>
+                  <pic:blipFill>
+                    <a:blip r:embed="rId11"/>
+                    <a:stretch>
+                      <a:fillRect/>
+                    </a:stretch>
+                  </pic:blipFill>
+                  <pic:spPr>
+                    <a:xfrm>
+                      <a:off x="0" y="0"/>
+                      <a:ext cx="5400000" cy="4951585"/>
+                    </a:xfrm>
+                    <a:prstGeom prst="rect"/>
+                  </pic:spPr>
+                </pic:pic>
+              </a:graphicData>
+            </a:graphic>
+          </wp:inline>
+        </w:drawing>
       </w:r>
     </w:p>
     <w:p>
@@ -9737,15 +9791,42 @@
       </w:r>
     </w:p>
     <w:p>
-      <w:r>
-        <w:rPr>
-          <w:rFonts w:ascii="Times New Roman" w:hAnsi="Times New Roman"/>
-          <w:b w:val="0"/>
-          <w:i/>
-          <w:color w:val="808080"/>
-          <w:sz w:val="20"/>
-        </w:rPr>
-        <w:t>[Figure 4 — figure image to be inserted]</w:t>
+      <w:pPr>
+        <w:jc w:val="center"/>
+      </w:pPr>
+      <w:r>
+        <w:drawing>
+          <wp:inline xmlns:a="http://schemas.openxmlformats.org/drawingml/2006/main" xmlns:pic="http://schemas.openxmlformats.org/drawingml/2006/picture">
+            <wp:extent cx="5400000" cy="2961102"/>
+            <wp:docPr id="4" name="Picture 4"/>
+            <wp:cNvGraphicFramePr>
+              <a:graphicFrameLocks noChangeAspect="1"/>
+            </wp:cNvGraphicFramePr>
+            <a:graphic>
+              <a:graphicData uri="http://schemas.openxmlformats.org/drawingml/2006/picture">
+                <pic:pic>
+                  <pic:nvPicPr>
+                    <pic:cNvPr id="0" name="figure4_cross_species.png"/>
+                    <pic:cNvPicPr/>
+                  </pic:nvPicPr>
+                  <pic:blipFill>
+                    <a:blip r:embed="rId12"/>
+                    <a:stretch>
+                      <a:fillRect/>
+                    </a:stretch>
+                  </pic:blipFill>
+                  <pic:spPr>
+                    <a:xfrm>
+                      <a:off x="0" y="0"/>
+                      <a:ext cx="5400000" cy="2961102"/>
+                    </a:xfrm>
+                    <a:prstGeom prst="rect"/>
+                  </pic:spPr>
+                </pic:pic>
+              </a:graphicData>
+            </a:graphic>
+          </wp:inline>
+        </w:drawing>
       </w:r>
     </w:p>
     <w:p>
@@ -9769,15 +9850,42 @@
       </w:r>
     </w:p>
     <w:p>
-      <w:r>
-        <w:rPr>
-          <w:rFonts w:ascii="Times New Roman" w:hAnsi="Times New Roman"/>
-          <w:b w:val="0"/>
-          <w:i/>
-          <w:color w:val="808080"/>
-          <w:sz w:val="20"/>
-        </w:rPr>
-        <w:t>[Figure 5 — figure image to be inserted]</w:t>
+      <w:pPr>
+        <w:jc w:val="center"/>
+      </w:pPr>
+      <w:r>
+        <w:drawing>
+          <wp:inline xmlns:a="http://schemas.openxmlformats.org/drawingml/2006/main" xmlns:pic="http://schemas.openxmlformats.org/drawingml/2006/picture">
+            <wp:extent cx="5400000" cy="1996377"/>
+            <wp:docPr id="5" name="Picture 5"/>
+            <wp:cNvGraphicFramePr>
+              <a:graphicFrameLocks noChangeAspect="1"/>
+            </wp:cNvGraphicFramePr>
+            <a:graphic>
+              <a:graphicData uri="http://schemas.openxmlformats.org/drawingml/2006/picture">
+                <pic:pic>
+                  <pic:nvPicPr>
+                    <pic:cNvPr id="0" name="figure5_drug_reversal.png"/>
+                    <pic:cNvPicPr/>
+                  </pic:nvPicPr>
+                  <pic:blipFill>
+                    <a:blip r:embed="rId13"/>
+                    <a:stretch>
+                      <a:fillRect/>
+                    </a:stretch>
+                  </pic:blipFill>
+                  <pic:spPr>
+                    <a:xfrm>
+                      <a:off x="0" y="0"/>
+                      <a:ext cx="5400000" cy="1996377"/>
+                    </a:xfrm>
+                    <a:prstGeom prst="rect"/>
+                  </pic:spPr>
+                </pic:pic>
+              </a:graphicData>
+            </a:graphic>
+          </wp:inline>
+        </w:drawing>
       </w:r>
     </w:p>
     <w:p>
@@ -9801,15 +9909,42 @@
       </w:r>
     </w:p>
     <w:p>
-      <w:r>
-        <w:rPr>
-          <w:rFonts w:ascii="Times New Roman" w:hAnsi="Times New Roman"/>
-          <w:b w:val="0"/>
-          <w:i/>
-          <w:color w:val="808080"/>
-          <w:sz w:val="20"/>
-        </w:rPr>
-        <w:t>[Figure 6 — figure image to be inserted]</w:t>
+      <w:pPr>
+        <w:jc w:val="center"/>
+      </w:pPr>
+      <w:r>
+        <w:drawing>
+          <wp:inline xmlns:a="http://schemas.openxmlformats.org/drawingml/2006/main" xmlns:pic="http://schemas.openxmlformats.org/drawingml/2006/picture">
+            <wp:extent cx="5400000" cy="3145488"/>
+            <wp:docPr id="6" name="Picture 6"/>
+            <wp:cNvGraphicFramePr>
+              <a:graphicFrameLocks noChangeAspect="1"/>
+            </wp:cNvGraphicFramePr>
+            <a:graphic>
+              <a:graphicData uri="http://schemas.openxmlformats.org/drawingml/2006/picture">
+                <pic:pic>
+                  <pic:nvPicPr>
+                    <pic:cNvPr id="0" name="figure6_L5_triangulation.png"/>
+                    <pic:cNvPicPr/>
+                  </pic:nvPicPr>
+                  <pic:blipFill>
+                    <a:blip r:embed="rId14"/>
+                    <a:stretch>
+                      <a:fillRect/>
+                    </a:stretch>
+                  </pic:blipFill>
+                  <pic:spPr>
+                    <a:xfrm>
+                      <a:off x="0" y="0"/>
+                      <a:ext cx="5400000" cy="3145488"/>
+                    </a:xfrm>
+                    <a:prstGeom prst="rect"/>
+                  </pic:spPr>
+                </pic:pic>
+              </a:graphicData>
+            </a:graphic>
+          </wp:inline>
+        </w:drawing>
       </w:r>
     </w:p>
     <w:p>
@@ -9833,15 +9968,42 @@
       </w:r>
     </w:p>
     <w:p>
-      <w:r>
-        <w:rPr>
-          <w:rFonts w:ascii="Times New Roman" w:hAnsi="Times New Roman"/>
-          <w:b w:val="0"/>
-          <w:i/>
-          <w:color w:val="808080"/>
-          <w:sz w:val="20"/>
-        </w:rPr>
-        <w:t>[Figure 7 — figure image to be inserted]</w:t>
+      <w:pPr>
+        <w:jc w:val="center"/>
+      </w:pPr>
+      <w:r>
+        <w:drawing>
+          <wp:inline xmlns:a="http://schemas.openxmlformats.org/drawingml/2006/main" xmlns:pic="http://schemas.openxmlformats.org/drawingml/2006/picture">
+            <wp:extent cx="5400000" cy="8451037"/>
+            <wp:docPr id="7" name="Picture 7"/>
+            <wp:cNvGraphicFramePr>
+              <a:graphicFrameLocks noChangeAspect="1"/>
+            </wp:cNvGraphicFramePr>
+            <a:graphic>
+              <a:graphicData uri="http://schemas.openxmlformats.org/drawingml/2006/picture">
+                <pic:pic>
+                  <pic:nvPicPr>
+                    <pic:cNvPr id="0" name="figure7_evidence_ladder.png"/>
+                    <pic:cNvPicPr/>
+                  </pic:nvPicPr>
+                  <pic:blipFill>
+                    <a:blip r:embed="rId15"/>
+                    <a:stretch>
+                      <a:fillRect/>
+                    </a:stretch>
+                  </pic:blipFill>
+                  <pic:spPr>
+                    <a:xfrm>
+                      <a:off x="0" y="0"/>
+                      <a:ext cx="5400000" cy="8451037"/>
+                    </a:xfrm>
+                    <a:prstGeom prst="rect"/>
+                  </pic:spPr>
+                </pic:pic>
+              </a:graphicData>
+            </a:graphic>
+          </wp:inline>
+        </w:drawing>
       </w:r>
     </w:p>
     <w:p>
@@ -14670,15 +14832,42 @@
       </w:r>
     </w:p>
     <w:p>
-      <w:r>
-        <w:rPr>
-          <w:rFonts w:ascii="Times New Roman" w:hAnsi="Times New Roman"/>
-          <w:b w:val="0"/>
-          <w:i/>
-          <w:color w:val="808080"/>
-          <w:sz w:val="20"/>
-        </w:rPr>
-        <w:t>[Figure S1 — figure image to be inserted]</w:t>
+      <w:pPr>
+        <w:jc w:val="center"/>
+      </w:pPr>
+      <w:r>
+        <w:drawing>
+          <wp:inline xmlns:a="http://schemas.openxmlformats.org/drawingml/2006/main" xmlns:pic="http://schemas.openxmlformats.org/drawingml/2006/picture">
+            <wp:extent cx="3960000" cy="4007063"/>
+            <wp:docPr id="8" name="Picture 8"/>
+            <wp:cNvGraphicFramePr>
+              <a:graphicFrameLocks noChangeAspect="1"/>
+            </wp:cNvGraphicFramePr>
+            <a:graphic>
+              <a:graphicData uri="http://schemas.openxmlformats.org/drawingml/2006/picture">
+                <pic:pic>
+                  <pic:nvPicPr>
+                    <pic:cNvPr id="0" name="figureS1_pc_correction.png"/>
+                    <pic:cNvPicPr/>
+                  </pic:nvPicPr>
+                  <pic:blipFill>
+                    <a:blip r:embed="rId16"/>
+                    <a:stretch>
+                      <a:fillRect/>
+                    </a:stretch>
+                  </pic:blipFill>
+                  <pic:spPr>
+                    <a:xfrm>
+                      <a:off x="0" y="0"/>
+                      <a:ext cx="3960000" cy="4007063"/>
+                    </a:xfrm>
+                    <a:prstGeom prst="rect"/>
+                  </pic:spPr>
+                </pic:pic>
+              </a:graphicData>
+            </a:graphic>
+          </wp:inline>
+        </w:drawing>
       </w:r>
     </w:p>
     <w:p>

</xml_diff>

<commit_message>
Apply figure-audit fixes: Fig5A plots reversal-hit breadth (n_hits) instead of degenerate tied best_score; Fig4/Fig6 now read L5/OR values from JSON with assertion; Fig2A no-difference cloud clamped so it cannot read as wins; manuscript L206 PC-correction direction-preservation aligned to figure data (69-79%, pooled 74%)
</commit_message>
<xml_diff>
--- a/gate1/rewiring_study/manuscript_v6_humanized.docx
+++ b/gate1/rewiring_study/manuscript_v6_humanized.docx
@@ -4958,7 +4958,7 @@
           <w:i w:val="0"/>
           <w:sz w:val="22"/>
         </w:rPr>
-        <w:t xml:space="preserve"> Targets of significant rewired edges were enriched for oligodendrocyte (OR 36–61), neuron (OR 110) and microglia (OR 15) markers; 14/15 known stroke-relevant TFs appeared, and 77–83 % of edges preserved their direction after PC composition correction, confirming the rewiring signal is not a compositional artefact. PC correction flipping raw→PC direction (e.g. </w:t>
+        <w:t xml:space="preserve"> Targets of significant rewired edges were enriched for oligodendrocyte (OR 36–61), neuron (OR 110) and microglia (OR 15) markers; 14/15 known stroke-relevant TFs appeared, and 69–79 % of significant edges (pooled 74 %) preserved their direction after PC composition correction, confirming the rewiring signal is not a compositional artefact. PC correction flipping raw→PC direction (e.g. </w:t>
       </w:r>
       <w:r>
         <w:rPr>
@@ -9905,7 +9905,7 @@
           <w:i w:val="0"/>
           <w:sz w:val="22"/>
         </w:rPr>
-        <w:t xml:space="preserve"> (A) Top-ranked L1000 compounds for the robust 24 h injury signature. (B) Permutation distribution (n = 20 random signatures) vs observed count (dashed line). (C) Cross-level convergence: drug targets align with rewiring-recovered programs.</w:t>
+        <w:t xml:space="preserve"> (A) Top L1000 compounds, shown by the number of cell types in which they reversed the robust 24 h injury signature. (B) Permutation distribution (n = 20 random signatures) vs observed count (dashed line). (C) Cross-level convergence: drug targets align with rewiring-recovered programs.</w:t>
       </w:r>
     </w:p>
     <w:p>

</xml_diff>

<commit_message>
Fill 33 verified Crossref DOIs in References; fix 4 citation errors (Carmichael journal/title, GEARS pages, scPerturb journal/vol, scGPT pages)
</commit_message>
<xml_diff>
--- a/gate1/rewiring_study/manuscript_v6_humanized.docx
+++ b/gate1/rewiring_study/manuscript_v6_humanized.docx
@@ -14965,7 +14965,7 @@
           <w:i w:val="0"/>
           <w:sz w:val="22"/>
         </w:rPr>
-        <w:t>2. Carmichael, S. T. (2016). The 3 Rs of stroke biology: repair, regeneration, remodelling. Nat. Rev. Neurosci. 17, 420–432. [DOI: pending]</w:t>
+        <w:t>Carmichael, S. T. (2016). The 3 Rs of Stroke Biology: Radial, Relayed, and Regenerative. Neurotherapeutics 13, 348–359. [DOI: 10.1007/s13311-015-0408-0]</w:t>
       </w:r>
     </w:p>
     <w:p>
@@ -15007,7 +15007,7 @@
           <w:i w:val="0"/>
           <w:sz w:val="22"/>
         </w:rPr>
-        <w:t>5. Kamimoto, K. et al. (2023). Dissecting cell identity via network inference and in silico gene perturbation. Nature 614, 742–751. [DOI: pending]</w:t>
+        <w:t>Kamimoto, K. et al. (2023). Dissecting cell identity via network inference and in silico gene perturbation. Nature 614, 742–751. [DOI: 10.1038/s41586-022-05688-9]</w:t>
       </w:r>
     </w:p>
     <w:p>
@@ -15021,7 +15021,7 @@
           <w:i w:val="0"/>
           <w:sz w:val="22"/>
         </w:rPr>
-        <w:t>6. Aibar, S. et al. (2017). SCENIC: single-cell regulatory network inference and clustering. Nat. Methods 14, 1083–1086. [DOI: pending]</w:t>
+        <w:t>Aibar, S. et al. (2017). SCENIC: single-cell regulatory network inference and clustering. Nat. Methods 14, 1083–1086. [DOI: 10.1038/nmeth.4463]</w:t>
       </w:r>
     </w:p>
     <w:p>
@@ -15035,7 +15035,7 @@
           <w:i w:val="0"/>
           <w:sz w:val="22"/>
         </w:rPr>
-        <w:t>7. Bravo González-Blas, C. et al. (2023). SCENIC+: single-cell multiomic inference of enhancer-driven gene regulatory networks. Nat. Methods 20, 1355–1367. [DOI: pending]</w:t>
+        <w:t>Bravo González-Blas, C. et al. (2023). SCENIC+: single-cell multiomic inference of enhancer-driven gene regulatory networks. Nat. Methods 20, 1355–1367. [DOI: 10.1038/s41592-023-01938-4]</w:t>
       </w:r>
     </w:p>
     <w:p>
@@ -15049,7 +15049,7 @@
           <w:i w:val="0"/>
           <w:sz w:val="22"/>
         </w:rPr>
-        <w:t>8. Browaeys, R., Saelens, W., and Saeys, Y. (2020). NicheNet: modeling intercellular communication by linking ligands to target genes. Nat. Methods 17, 159–162. [DOI: pending]</w:t>
+        <w:t>Browaeys, R., Saelens, W., and Saeys, Y. (2020). NicheNet: modeling intercellular communication by linking ligands to target genes. Nat. Methods 17, 159–162. [DOI: 10.1038/s41592-019-0667-5]</w:t>
       </w:r>
     </w:p>
     <w:p>
@@ -15063,7 +15063,7 @@
           <w:i w:val="0"/>
           <w:sz w:val="22"/>
         </w:rPr>
-        <w:t>9. Roohani, Y., Huang, K., and Leskovec, J. (2023). Predicting transcriptional outcomes of novel multigene perturbations with GEARS. Nat. Biotechnol. 42, 157–166. [DOI: pending]</w:t>
+        <w:t>Roohani, Y., Huang, K., and Leskovec, J. (2023). Predicting transcriptional outcomes of novel multigene perturbations with GEARS. Nat. Biotechnol. 42, 927–935. [DOI: 10.1038/s41587-023-01905-6]</w:t>
       </w:r>
     </w:p>
     <w:p>
@@ -15077,7 +15077,7 @@
           <w:i w:val="0"/>
           <w:sz w:val="22"/>
         </w:rPr>
-        <w:t>10. Cui, H. et al. (2024). scGPT: toward building a foundation model for single-cell multi-omics. Nat. Methods 21, 1469–1480. [DOI: pending]</w:t>
+        <w:t>Cui, H. et al. (2024). scGPT: toward building a foundation model for single-cell multi-omics. Nat. Methods 21, 1470–1480. [DOI: 10.1038/s41592-024-02201-0]</w:t>
       </w:r>
     </w:p>
     <w:p>
@@ -15091,7 +15091,7 @@
           <w:i w:val="0"/>
           <w:sz w:val="22"/>
         </w:rPr>
-        <w:t>11. Hao, M. et al. (2024). Large-scale foundation model for single-cell transcriptomics. Nat. Methods 21, 1481–1491. [DOI: pending]</w:t>
+        <w:t>Hao, M. et al. (2024). Large-scale foundation model for single-cell transcriptomics. Nat. Methods 21, 1481–1491. [DOI: 10.1038/s41592-024-02305-7]</w:t>
       </w:r>
     </w:p>
     <w:p>
@@ -15105,7 +15105,7 @@
           <w:i w:val="0"/>
           <w:sz w:val="22"/>
         </w:rPr>
-        <w:t>12. Wang, W., Hu, Z., Weiler, P., Mayes, S., Lange, M., Fountain, D. M., Haug, J. O., Wang, J., Xue, Z., Sauka-Spengler, T., and Theis, F. J. (2026). RegVelo: gene-regulatory-informed dynamics of single cells. Cell 189, 3773–3800.e44. [DOI: pending]</w:t>
+        <w:t>Wang, W., Hu, Z., Weiler, P., Mayes, S., Lange, M., Fountain, D. M., Haug, J. O., Wang, J., Xue, Z., Sauka-Spengler, T., and Theis, F. J. (2026). RegVelo: gene-regulatory-informed dynamics of single cells. Cell 189, 3773–3800.e44. [DOI: 10.1016/j.cell.2026.04.022]</w:t>
       </w:r>
     </w:p>
     <w:p>
@@ -15119,7 +15119,7 @@
           <w:i w:val="0"/>
           <w:sz w:val="22"/>
         </w:rPr>
-        <w:t>13. Liu, Y., Cai, F., Barile, M., Chang, Y., Cao, D., and Huang, Y. (2025). TemporalVAE: atlas-assisted temporal mapping of time-series single-cell transcriptomes during embryogenesis. Nat. Cell Biol. 27, 1982–1992. [DOI: pending]</w:t>
+        <w:t>Liu, Y., Cai, F., Barile, M., Chang, Y., Cao, D., and Huang, Y. (2025). TemporalVAE: atlas-assisted temporal mapping of time-series single-cell transcriptomes during embryogenesis. Nat. Cell Biol. 27, 1982–1992. [DOI: 10.1038/s41556-025-01787-7]</w:t>
       </w:r>
     </w:p>
     <w:p>
@@ -15133,7 +15133,7 @@
           <w:i w:val="0"/>
           <w:sz w:val="22"/>
         </w:rPr>
-        <w:t>14. Ishikawa, M. et al. (2023). RENGE infers gene regulatory networks using time-series single-cell RNA-seq data with CRISPR perturbations. Commun. Biol. 6, 1290. [DOI: pending]</w:t>
+        <w:t>Ishikawa, M. et al. (2023). RENGE infers gene regulatory networks using time-series single-cell RNA-seq data with CRISPR perturbations. Commun. Biol. 6, 1290. [DOI: 10.1038/s42003-023-05594-4]</w:t>
       </w:r>
     </w:p>
     <w:p>
@@ -15217,7 +15217,7 @@
           <w:i w:val="0"/>
           <w:sz w:val="22"/>
         </w:rPr>
-        <w:t>20. Garcia-Alonso, L. et al. (2019). Benchmark and integration of resources for the estimation of human transcription factor activities. Genome Res. 29, 1363–1375. [DOI: pending]</w:t>
+        <w:t>Garcia-Alonso, L. et al. (2019). Benchmark and integration of resources for the estimation of human transcription factor activities. Genome Res. 29, 1363–1375. [DOI: 10.1101/gr.240663.118]</w:t>
       </w:r>
     </w:p>
     <w:p>
@@ -15231,7 +15231,7 @@
           <w:i w:val="0"/>
           <w:sz w:val="22"/>
         </w:rPr>
-        <w:t>21. Jin, S. et al. (2021). Inference and analysis of cell–cell communication using CellChat. Nat. Commun. 12, 1088. [DOI: pending]</w:t>
+        <w:t>Jin, S. et al. (2021). Inference and analysis of cell–cell communication using CellChat. Nat. Commun. 12, 1088. [DOI: 10.1038/s41467-021-21246-9]</w:t>
       </w:r>
     </w:p>
     <w:p>
@@ -15245,7 +15245,7 @@
           <w:i w:val="0"/>
           <w:sz w:val="22"/>
         </w:rPr>
-        <w:t>22. Duan, Q. et al. (2016). L1000CDS2: LINCS L1000 characteristic direction signatures search engine. npj Syst. Biol. Appl. 2, 16015. [DOI: pending]</w:t>
+        <w:t>Duan, Q. et al. (2016). L1000CDS2: LINCS L1000 characteristic direction signatures search engine. npj Syst. Biol. Appl. 2, 16015. [DOI: 10.1038/npjsba.2016.15]</w:t>
       </w:r>
     </w:p>
     <w:p>
@@ -15259,7 +15259,7 @@
           <w:i w:val="0"/>
           <w:sz w:val="22"/>
         </w:rPr>
-        <w:t>23. Stolt, C. C. et al. (2002). Terminal differentiation of myelin-forming oligodendrocytes depends on the transcription factor Sox10. Genes Dev. 16, 165–170. [DOI: pending]</w:t>
+        <w:t>Stolt, C. C. et al. (2002). Terminal differentiation of myelin-forming oligodendrocytes depends on the transcription factor Sox10. Genes Dev. 16, 165–170. [DOI: 10.1101/gad.215802]</w:t>
       </w:r>
     </w:p>
     <w:p>
@@ -15273,7 +15273,7 @@
           <w:i w:val="0"/>
           <w:sz w:val="22"/>
         </w:rPr>
-        <w:t>24. Nave, K. A. (2010). Myelination and support of axonal integrity by glia. Nat. Rev. Neurosci. 11, 275–283. [DOI: pending]</w:t>
+        <w:t>Nave, K. A. (2010). Myelination and support of axonal integrity by glia. Nat. Rev. Neurosci. 11, 275–283. [DOI: 10.1038/nrn2797]</w:t>
       </w:r>
     </w:p>
     <w:p>
@@ -15301,7 +15301,7 @@
           <w:i w:val="0"/>
           <w:sz w:val="22"/>
         </w:rPr>
-        <w:t>26. Morgan, J. I., and Curran, T. (1991). Stimulus-transcription coupling in the nervous system: involvement of the inducible proto-oncogenes fos and jun. Annu. Rev. Neurosci. 14, 421–451. [DOI: pending]</w:t>
+        <w:t>Morgan, J. I., and Curran, T. (1991). Stimulus-transcription coupling in the nervous system: involvement of the inducible proto-oncogenes fos and jun. Annu. Rev. Neurosci. 14, 421–451. [DOI: 10.1146/annurev.neuro.14.1.421]</w:t>
       </w:r>
     </w:p>
     <w:p>
@@ -15315,7 +15315,7 @@
           <w:i w:val="0"/>
           <w:sz w:val="22"/>
         </w:rPr>
-        <w:t>27. Zawadzka, M. et al. (2010). CNS-resident glial progenitor/stem cells produce Schwann cells as well as oligodendrocytes during repair of CNS demyelination. Cell Stem Cell 6, 578–590. [DOI: pending]</w:t>
+        <w:t>Zawadzka, M. et al. (2010). CNS-resident glial progenitor/stem cells produce Schwann cells as well as oligodendrocytes during repair of CNS demyelination. Cell Stem Cell 6, 578–590. [DOI: 10.1016/j.stem.2010.04.002]</w:t>
       </w:r>
     </w:p>
     <w:p>
@@ -15371,7 +15371,7 @@
           <w:i w:val="0"/>
           <w:sz w:val="22"/>
         </w:rPr>
-        <w:t>31. Barbie, D. A. et al. (2009). Systematic RNA interference reveals that oncogenic KRAS-driven cancers require TBK1. Nature 462, 108–112. [DOI: pending]</w:t>
+        <w:t>Barbie, D. A. et al. (2009). Systematic RNA interference reveals that oncogenic KRAS-driven cancers require TBK1. Nature 462, 108–112. [DOI: 10.1038/nature08460]</w:t>
       </w:r>
     </w:p>
     <w:p>
@@ -15385,7 +15385,7 @@
           <w:i w:val="0"/>
           <w:sz w:val="22"/>
         </w:rPr>
-        <w:t>32. Benjamini, Y., and Hochberg, Y. (1995). Controlling the false discovery rate: a practical and powerful approach to multiple testing. J. R. Stat. Soc. B 57, 289–300. [DOI: pending]</w:t>
+        <w:t>Benjamini, Y., and Hochberg, Y. (1995). Controlling the false discovery rate: a practical and powerful approach to multiple testing. J. R. Stat. Soc. B 57, 289–300. [DOI: 10.1111/j.2517-6161.1995.tb02031.x]</w:t>
       </w:r>
     </w:p>
     <w:p>
@@ -15399,7 +15399,7 @@
           <w:i w:val="0"/>
           <w:sz w:val="22"/>
         </w:rPr>
-        <w:t>33. Jörg, L. M. et al. (2024). Transcription factors Sox8 and Sox10 contribute with different importance to the maintenance of mature oligodendrocytes. Int. J. Mol. Sci. 25, 8754. [DOI: pending]</w:t>
+        <w:t>Jörg, L. M. et al. (2024). Transcription factors Sox8 and Sox10 contribute with different importance to the maintenance of mature oligodendrocytes. Int. J. Mol. Sci. 25, 8754. [DOI: 10.3390/ijms25168754]</w:t>
       </w:r>
     </w:p>
     <w:p>
@@ -15413,7 +15413,7 @@
           <w:i w:val="0"/>
           <w:sz w:val="22"/>
         </w:rPr>
-        <w:t>34. Lin, S.-Z. et al. (2025). C/EBPβ–VCAM1 axis in Kupffer cells promotes hepatic inflammation in MASLD. JHEP Rep. 7, 101418. [DOI: pending]</w:t>
+        <w:t>Lin, S.-Z. et al. (2025). C/EBPβ–VCAM1 axis in Kupffer cells promotes hepatic inflammation in MASLD. JHEP Rep. 7, 101418. [DOI: 10.1016/j.jhepr.2025.101418]</w:t>
       </w:r>
     </w:p>
     <w:p>
@@ -15427,7 +15427,7 @@
           <w:i w:val="0"/>
           <w:sz w:val="22"/>
         </w:rPr>
-        <w:t>35. Subramanian, A. et al. (2017). A next generation connectivity map: L1000 platform and the first 1,000,000 profiles. Cell 171, 1437–1452.e17. [DOI: pending]</w:t>
+        <w:t>Subramanian, A. et al. (2017). A next generation connectivity map: L1000 platform and the first 1,000,000 profiles. Cell 171, 1437–1452.e17. [DOI: 10.1016/j.cell.2017.10.049]</w:t>
       </w:r>
     </w:p>
     <w:p>
@@ -15441,7 +15441,7 @@
           <w:i w:val="0"/>
           <w:sz w:val="22"/>
         </w:rPr>
-        <w:t>36. Replogle, J. M. et al. (2022). Mapping information-rich genotype–phenotype landscapes with genome-scale Perturb-seq. Cell 185, 2559–2575.e28. [DOI: pending]</w:t>
+        <w:t>Replogle, J. M. et al. (2022). Mapping information-rich genotype–phenotype landscapes with genome-scale Perturb-seq. Cell 185, 2559–2575.e28. [DOI: 10.1016/j.cell.2022.05.013]</w:t>
       </w:r>
     </w:p>
     <w:p>
@@ -15511,7 +15511,7 @@
           <w:i w:val="0"/>
           <w:sz w:val="22"/>
         </w:rPr>
-        <w:t>41. Peidli, I. et al. (2024). scPerturb: harmonized single-cell perturbation data. Nat. Biotechnol. 42, 1311–1319. [DOI: pending]</w:t>
+        <w:t>Peidli, I. et al. (2024). scPerturb: harmonized single-cell perturbation data. Nature Methods 21, 531–540. [DOI: 10.1038/s41592-023-02144-y]</w:t>
       </w:r>
     </w:p>
     <w:p>
@@ -15539,7 +15539,7 @@
           <w:i w:val="0"/>
           <w:sz w:val="22"/>
         </w:rPr>
-        <w:t>43. Pratapa, A. et al. (2020). Benchmarking algorithms for gene regulatory network inference from single-cell transcriptomic data. Nat. Methods 17, 147–154. [DOI: pending]</w:t>
+        <w:t>Pratapa, A. et al. (2020). Benchmarking algorithms for gene regulatory network inference from single-cell transcriptomic data. Nat. Methods 17, 147–154. [DOI: 10.1038/s41592-019-0690-6]</w:t>
       </w:r>
     </w:p>
     <w:p>
@@ -15567,7 +15567,7 @@
           <w:i w:val="0"/>
           <w:sz w:val="22"/>
         </w:rPr>
-        <w:t>45. Adamson, B. et al. (2016). A multiplexed single-cell CRISPR screening platform enables systematic dissection of the unfolded protein response. Cell 167, 1867–1882.e21. [DOI: pending]</w:t>
+        <w:t>Adamson, B. et al. (2016). A multiplexed single-cell CRISPR screening platform enables systematic dissection of the unfolded protein response. Cell 167, 1867–1882.e21. [DOI: 10.1016/j.cell.2016.11.048]</w:t>
       </w:r>
     </w:p>
     <w:p>
@@ -15581,7 +15581,7 @@
           <w:i w:val="0"/>
           <w:sz w:val="22"/>
         </w:rPr>
-        <w:t>46. Dixit, A. et al. (2016). Perturb-Seq: dissecting molecular circuits with scalable single-cell RNA profiling of pooled genetic screens. Cell 167, 1853–1866.e17. [DOI: pending]</w:t>
+        <w:t>Dixit, A. et al. (2016). Perturb-Seq: dissecting molecular circuits with scalable single-cell RNA profiling of pooled genetic screens. Cell 167, 1853–1866.e17. [DOI: 10.1016/j.cell.2016.11.038]</w:t>
       </w:r>
     </w:p>
     <w:p>
@@ -15651,7 +15651,7 @@
           <w:i w:val="0"/>
           <w:sz w:val="22"/>
         </w:rPr>
-        <w:t>51. Margolin, A. A. et al. (2006). ARACNE: an algorithm for the reconstruction of gene regulatory networks in a mammalian cellular context. BMC Bioinformatics 7, S7. [DOI: pending]</w:t>
+        <w:t>Margolin, A. A. et al. (2006). ARACNE: an algorithm for the reconstruction of gene regulatory networks in a mammalian cellular context. BMC Bioinformatics 7, S7. [DOI: 10.1186/1471-2105-7-s1-s7]</w:t>
       </w:r>
     </w:p>
     <w:p>
@@ -15665,7 +15665,7 @@
           <w:i w:val="0"/>
           <w:sz w:val="22"/>
         </w:rPr>
-        <w:t>52. Edelman, G. M., and Gally, J. A. (2001). Degeneracy and complexity in biological systems. Proc. Natl Acad. Sci. USA 98, 13763–13768. [DOI: pending]</w:t>
+        <w:t>Edelman, G. M., and Gally, J. A. (2001). Degeneracy and complexity in biological systems. Proc. Natl Acad. Sci. USA 98, 13763–13768. [DOI: 10.1073/pnas.231499798]</w:t>
       </w:r>
     </w:p>
     <w:p>
@@ -15679,7 +15679,7 @@
           <w:i w:val="0"/>
           <w:sz w:val="22"/>
         </w:rPr>
-        <w:t>53. Whitacre, J. M. (2010). Degeneracy: a link between evolvability, robustness and complexity in biological systems. Theor. Biol. Med. Model. 7, 6. [DOI: pending]</w:t>
+        <w:t>Whitacre, J. M. (2010). Degeneracy: a link between evolvability, robustness and complexity in biological systems. Theor. Biol. Med. Model. 7, 6. [DOI: 10.1186/1742-4682-7-6]</w:t>
       </w:r>
     </w:p>
     <w:p>
@@ -15707,7 +15707,7 @@
           <w:i w:val="0"/>
           <w:sz w:val="22"/>
         </w:rPr>
-        <w:t>55. Huang, S. (2009). Reprogramming cell fates: reconciling rarity with robustness. BioEssays 31, 546–560. [DOI: pending]</w:t>
+        <w:t>Huang, S. (2009). Reprogramming cell fates: reconciling rarity with robustness. BioEssays 31, 546–560. [DOI: 10.1002/bies.200800189]</w:t>
       </w:r>
     </w:p>
     <w:p>
@@ -15721,7 +15721,7 @@
           <w:i w:val="0"/>
           <w:sz w:val="22"/>
         </w:rPr>
-        <w:t>56. Raj, A., and van Oudenaarden, A. (2008). Nature, nurture, or chance: stochastic gene expression and its consequences. Cell 135, 216–226. [DOI: pending]</w:t>
+        <w:t>Raj, A., and van Oudenaarden, A. (2008). Nature, nurture, or chance: stochastic gene expression and its consequences. Cell 135, 216–226. [DOI: 10.1016/j.cell.2008.09.050]</w:t>
       </w:r>
     </w:p>
     <w:sectPr>

</xml_diff>

<commit_message>
Fix reference numbering (56 entries, 1-56 sequential, remove stray note); rebuild docx
</commit_message>
<xml_diff>
--- a/gate1/rewiring_study/manuscript_v6_humanized.docx
+++ b/gate1/rewiring_study/manuscript_v6_humanized.docx
@@ -14923,7 +14923,7 @@
           <w:i w:val="0"/>
           <w:sz w:val="22"/>
         </w:rPr>
-        <w:t>&gt; References reformatted to Cell Press style; DOIs and journal standard abbreviations to be verified before submission.</w:t>
+        <w:t>1. Cramer, S. C., and Carrico, C. R. (2008). Stroke recovery: a perspective on mechanisms. Nat. Rev. Neurosci. 9, 720–731. [DOI: pending]</w:t>
       </w:r>
     </w:p>
     <w:p>
@@ -14937,7 +14937,7 @@
           <w:i w:val="0"/>
           <w:sz w:val="22"/>
         </w:rPr>
-        <w:t>---</w:t>
+        <w:t>2. Carmichael, S. T. (2016). The 3 Rs of Stroke Biology: Radial, Relayed, and Regenerative. Neurotherapeutics 13, 348–359. [DOI: 10.1007/s13311-015-0408-0]</w:t>
       </w:r>
     </w:p>
     <w:p>
@@ -14951,7 +14951,7 @@
           <w:i w:val="0"/>
           <w:sz w:val="22"/>
         </w:rPr>
-        <w:t>1. Cramer, S. C., and Carrico, C. R. (2008). Stroke recovery: a perspective on mechanisms. Nat. Rev. Neurosci. 9, 720–731. [DOI: pending]</w:t>
+        <w:t>3. Li, S. et al. (2021). Single-cell transcriptomic analysis of ischemic stroke reveals the temporal dynamics of glial and neuronal responses. Acta Neuropathol. Commun. 9, 152. [DOI: pending]</w:t>
       </w:r>
     </w:p>
     <w:p>
@@ -14965,7 +14965,7 @@
           <w:i w:val="0"/>
           <w:sz w:val="22"/>
         </w:rPr>
-        <w:t>Carmichael, S. T. (2016). The 3 Rs of Stroke Biology: Radial, Relayed, and Regenerative. Neurotherapeutics 13, 348–359. [DOI: 10.1007/s13311-015-0408-0]</w:t>
+        <w:t>4. Anrather, J. et al. (2024). Single-cell RNA sequencing of the post-stroke brain and blood reveals a temporally coordinated immune response. Nat. Immunol. 25, 294–307. [DOI: pending]</w:t>
       </w:r>
     </w:p>
     <w:p>
@@ -14979,7 +14979,7 @@
           <w:i w:val="0"/>
           <w:sz w:val="22"/>
         </w:rPr>
-        <w:t>3. Li, S. et al. (2021). Single-cell transcriptomic analysis of ischemic stroke reveals the temporal dynamics of glial and neuronal responses. Acta Neuropathol. Commun. 9, 152. [DOI: pending]</w:t>
+        <w:t>5. Kamimoto, K. et al. (2023). Dissecting cell identity via network inference and in silico gene perturbation. Nature 614, 742–751. [DOI: 10.1038/s41586-022-05688-9]</w:t>
       </w:r>
     </w:p>
     <w:p>
@@ -14993,7 +14993,7 @@
           <w:i w:val="0"/>
           <w:sz w:val="22"/>
         </w:rPr>
-        <w:t>4. Anrather, J. et al. (2024). Single-cell RNA sequencing of the post-stroke brain and blood reveals a temporally coordinated immune response. Nat. Immunol. 25, 294–307. [DOI: pending]</w:t>
+        <w:t>6. Aibar, S. et al. (2017). SCENIC: single-cell regulatory network inference and clustering. Nat. Methods 14, 1083–1086. [DOI: 10.1038/nmeth.4463]</w:t>
       </w:r>
     </w:p>
     <w:p>
@@ -15007,7 +15007,7 @@
           <w:i w:val="0"/>
           <w:sz w:val="22"/>
         </w:rPr>
-        <w:t>Kamimoto, K. et al. (2023). Dissecting cell identity via network inference and in silico gene perturbation. Nature 614, 742–751. [DOI: 10.1038/s41586-022-05688-9]</w:t>
+        <w:t>7. Bravo González-Blas, C. et al. (2023). SCENIC+: single-cell multiomic inference of enhancer-driven gene regulatory networks. Nat. Methods 20, 1355–1367. [DOI: 10.1038/s41592-023-01938-4]</w:t>
       </w:r>
     </w:p>
     <w:p>
@@ -15021,7 +15021,7 @@
           <w:i w:val="0"/>
           <w:sz w:val="22"/>
         </w:rPr>
-        <w:t>Aibar, S. et al. (2017). SCENIC: single-cell regulatory network inference and clustering. Nat. Methods 14, 1083–1086. [DOI: 10.1038/nmeth.4463]</w:t>
+        <w:t>8. Browaeys, R., Saelens, W., and Saeys, Y. (2020). NicheNet: modeling intercellular communication by linking ligands to target genes. Nat. Methods 17, 159–162. [DOI: 10.1038/s41592-019-0667-5]</w:t>
       </w:r>
     </w:p>
     <w:p>
@@ -15035,7 +15035,7 @@
           <w:i w:val="0"/>
           <w:sz w:val="22"/>
         </w:rPr>
-        <w:t>Bravo González-Blas, C. et al. (2023). SCENIC+: single-cell multiomic inference of enhancer-driven gene regulatory networks. Nat. Methods 20, 1355–1367. [DOI: 10.1038/s41592-023-01938-4]</w:t>
+        <w:t>9. Roohani, Y., Huang, K., and Leskovec, J. (2023). Predicting transcriptional outcomes of novel multigene perturbations with GEARS. Nat. Biotechnol. 42, 927–935. [DOI: 10.1038/s41587-023-01905-6]</w:t>
       </w:r>
     </w:p>
     <w:p>
@@ -15049,7 +15049,7 @@
           <w:i w:val="0"/>
           <w:sz w:val="22"/>
         </w:rPr>
-        <w:t>Browaeys, R., Saelens, W., and Saeys, Y. (2020). NicheNet: modeling intercellular communication by linking ligands to target genes. Nat. Methods 17, 159–162. [DOI: 10.1038/s41592-019-0667-5]</w:t>
+        <w:t>10. Cui, H. et al. (2024). scGPT: toward building a foundation model for single-cell multi-omics. Nat. Methods 21, 1470–1480. [DOI: 10.1038/s41592-024-02201-0]</w:t>
       </w:r>
     </w:p>
     <w:p>
@@ -15063,7 +15063,7 @@
           <w:i w:val="0"/>
           <w:sz w:val="22"/>
         </w:rPr>
-        <w:t>Roohani, Y., Huang, K., and Leskovec, J. (2023). Predicting transcriptional outcomes of novel multigene perturbations with GEARS. Nat. Biotechnol. 42, 927–935. [DOI: 10.1038/s41587-023-01905-6]</w:t>
+        <w:t>11. Hao, M. et al. (2024). Large-scale foundation model for single-cell transcriptomics. Nat. Methods 21, 1481–1491. [DOI: 10.1038/s41592-024-02305-7]</w:t>
       </w:r>
     </w:p>
     <w:p>
@@ -15077,7 +15077,7 @@
           <w:i w:val="0"/>
           <w:sz w:val="22"/>
         </w:rPr>
-        <w:t>Cui, H. et al. (2024). scGPT: toward building a foundation model for single-cell multi-omics. Nat. Methods 21, 1470–1480. [DOI: 10.1038/s41592-024-02201-0]</w:t>
+        <w:t>12. Wang, W., Hu, Z., Weiler, P., Mayes, S., Lange, M., Fountain, D. M., Haug, J. O., Wang, J., Xue, Z., Sauka-Spengler, T., and Theis, F. J. (2026). RegVelo: gene-regulatory-informed dynamics of single cells. Cell 189, 3773–3800.e44. [DOI: 10.1016/j.cell.2026.04.022]</w:t>
       </w:r>
     </w:p>
     <w:p>
@@ -15091,7 +15091,7 @@
           <w:i w:val="0"/>
           <w:sz w:val="22"/>
         </w:rPr>
-        <w:t>Hao, M. et al. (2024). Large-scale foundation model for single-cell transcriptomics. Nat. Methods 21, 1481–1491. [DOI: 10.1038/s41592-024-02305-7]</w:t>
+        <w:t>13. Liu, Y., Cai, F., Barile, M., Chang, Y., Cao, D., and Huang, Y. (2025). TemporalVAE: atlas-assisted temporal mapping of time-series single-cell transcriptomes during embryogenesis. Nat. Cell Biol. 27, 1982–1992. [DOI: 10.1038/s41556-025-01787-7]</w:t>
       </w:r>
     </w:p>
     <w:p>
@@ -15105,7 +15105,7 @@
           <w:i w:val="0"/>
           <w:sz w:val="22"/>
         </w:rPr>
-        <w:t>Wang, W., Hu, Z., Weiler, P., Mayes, S., Lange, M., Fountain, D. M., Haug, J. O., Wang, J., Xue, Z., Sauka-Spengler, T., and Theis, F. J. (2026). RegVelo: gene-regulatory-informed dynamics of single cells. Cell 189, 3773–3800.e44. [DOI: 10.1016/j.cell.2026.04.022]</w:t>
+        <w:t>14. Ishikawa, M. et al. (2023). RENGE infers gene regulatory networks using time-series single-cell RNA-seq data with CRISPR perturbations. Commun. Biol. 6, 1290. [DOI: 10.1038/s42003-023-05594-4]</w:t>
       </w:r>
     </w:p>
     <w:p>
@@ -15119,7 +15119,7 @@
           <w:i w:val="0"/>
           <w:sz w:val="22"/>
         </w:rPr>
-        <w:t>Liu, Y., Cai, F., Barile, M., Chang, Y., Cao, D., and Huang, Y. (2025). TemporalVAE: atlas-assisted temporal mapping of time-series single-cell transcriptomes during embryogenesis. Nat. Cell Biol. 27, 1982–1992. [DOI: 10.1038/s41556-025-01787-7]</w:t>
+        <w:t>15. Kipf, T. N., and Welling, M. (2017). Semi-supervised classification with graph convolutional networks. Proc. ICLR. [DOI: pending]</w:t>
       </w:r>
     </w:p>
     <w:p>
@@ -15133,7 +15133,7 @@
           <w:i w:val="0"/>
           <w:sz w:val="22"/>
         </w:rPr>
-        <w:t>Ishikawa, M. et al. (2023). RENGE infers gene regulatory networks using time-series single-cell RNA-seq data with CRISPR perturbations. Commun. Biol. 6, 1290. [DOI: 10.1038/s42003-023-05594-4]</w:t>
+        <w:t>16. Veličković, P. et al. (2018). Graph attention networks. Proc. ICLR. [DOI: pending]</w:t>
       </w:r>
     </w:p>
     <w:p>
@@ -15147,7 +15147,7 @@
           <w:i w:val="0"/>
           <w:sz w:val="22"/>
         </w:rPr>
-        <w:t>15. Kipf, T. N., and Welling, M. (2017). Semi-supervised classification with graph convolutional networks. Proc. ICLR. [DOI: pending]</w:t>
+        <w:t>17. Hamilton, W. L., Ying, Z., and Leskovec, J. (2017). Inductive representation learning on large graphs. Proc. NeurIPS. [DOI: pending]</w:t>
       </w:r>
     </w:p>
     <w:p>
@@ -15161,7 +15161,7 @@
           <w:i w:val="0"/>
           <w:sz w:val="22"/>
         </w:rPr>
-        <w:t>16. Veličković, P. et al. (2018). Graph attention networks. Proc. ICLR. [DOI: pending]</w:t>
+        <w:t>18. Dwivedi, V. P. et al. (2023). Graph neural networks: a review of methods and applications. NeurIPS. [DOI: pending]</w:t>
       </w:r>
     </w:p>
     <w:p>
@@ -15175,7 +15175,7 @@
           <w:i w:val="0"/>
           <w:sz w:val="22"/>
         </w:rPr>
-        <w:t>17. Hamilton, W. L., Ying, Z., and Leskovec, J. (2017). Inductive representation learning on large graphs. Proc. NeurIPS. [DOI: pending]</w:t>
+        <w:t>19. Lotfollahi, M. et al. (2019). Predicting cellular responses to perturbations with scGen. Nat. Methods 16, 1253–1261. [DOI: pending]</w:t>
       </w:r>
     </w:p>
     <w:p>
@@ -15189,7 +15189,7 @@
           <w:i w:val="0"/>
           <w:sz w:val="22"/>
         </w:rPr>
-        <w:t>18. Dwivedi, V. P. et al. (2023). Graph neural networks: a review of methods and applications. NeurIPS. [DOI: pending]</w:t>
+        <w:t>20. Garcia-Alonso, L. et al. (2019). Benchmark and integration of resources for the estimation of human transcription factor activities. Genome Res. 29, 1363–1375. [DOI: 10.1101/gr.240663.118]</w:t>
       </w:r>
     </w:p>
     <w:p>
@@ -15203,7 +15203,7 @@
           <w:i w:val="0"/>
           <w:sz w:val="22"/>
         </w:rPr>
-        <w:t>19. Lotfollahi, M. et al. (2019). Predicting cellular responses to perturbations with scGen. Nat. Methods 16, 1253–1261. [DOI: pending]</w:t>
+        <w:t>21. Jin, S. et al. (2021). Inference and analysis of cell–cell communication using CellChat. Nat. Commun. 12, 1088. [DOI: 10.1038/s41467-021-21246-9]</w:t>
       </w:r>
     </w:p>
     <w:p>
@@ -15217,7 +15217,7 @@
           <w:i w:val="0"/>
           <w:sz w:val="22"/>
         </w:rPr>
-        <w:t>Garcia-Alonso, L. et al. (2019). Benchmark and integration of resources for the estimation of human transcription factor activities. Genome Res. 29, 1363–1375. [DOI: 10.1101/gr.240663.118]</w:t>
+        <w:t>22. Duan, Q. et al. (2016). L1000CDS2: LINCS L1000 characteristic direction signatures search engine. npj Syst. Biol. Appl. 2, 16015. [DOI: 10.1038/npjsba.2016.15]</w:t>
       </w:r>
     </w:p>
     <w:p>
@@ -15231,7 +15231,7 @@
           <w:i w:val="0"/>
           <w:sz w:val="22"/>
         </w:rPr>
-        <w:t>Jin, S. et al. (2021). Inference and analysis of cell–cell communication using CellChat. Nat. Commun. 12, 1088. [DOI: 10.1038/s41467-021-21246-9]</w:t>
+        <w:t>23. Stolt, C. C. et al. (2002). Terminal differentiation of myelin-forming oligodendrocytes depends on the transcription factor Sox10. Genes Dev. 16, 165–170. [DOI: 10.1101/gad.215802]</w:t>
       </w:r>
     </w:p>
     <w:p>
@@ -15245,7 +15245,7 @@
           <w:i w:val="0"/>
           <w:sz w:val="22"/>
         </w:rPr>
-        <w:t>Duan, Q. et al. (2016). L1000CDS2: LINCS L1000 characteristic direction signatures search engine. npj Syst. Biol. Appl. 2, 16015. [DOI: 10.1038/npjsba.2016.15]</w:t>
+        <w:t>24. Nave, K. A. (2010). Myelination and support of axonal integrity by glia. Nat. Rev. Neurosci. 11, 275–283. [DOI: 10.1038/nrn2797]</w:t>
       </w:r>
     </w:p>
     <w:p>
@@ -15259,7 +15259,7 @@
           <w:i w:val="0"/>
           <w:sz w:val="22"/>
         </w:rPr>
-        <w:t>Stolt, C. C. et al. (2002). Terminal differentiation of myelin-forming oligodendrocytes depends on the transcription factor Sox10. Genes Dev. 16, 165–170. [DOI: 10.1101/gad.215802]</w:t>
+        <w:t>25. Fancy, S. P. J. et al. (2011). Myelin regeneration: a review of the cellular and molecular mechanisms. Ann. Neurol. 69, 579–589. [DOI: pending]</w:t>
       </w:r>
     </w:p>
     <w:p>
@@ -15273,7 +15273,7 @@
           <w:i w:val="0"/>
           <w:sz w:val="22"/>
         </w:rPr>
-        <w:t>Nave, K. A. (2010). Myelination and support of axonal integrity by glia. Nat. Rev. Neurosci. 11, 275–283. [DOI: 10.1038/nrn2797]</w:t>
+        <w:t>26. Morgan, J. I., and Curran, T. (1991). Stimulus-transcription coupling in the nervous system: involvement of the inducible proto-oncogenes fos and jun. Annu. Rev. Neurosci. 14, 421–451. [DOI: 10.1146/annurev.neuro.14.1.421]</w:t>
       </w:r>
     </w:p>
     <w:p>
@@ -15287,7 +15287,7 @@
           <w:i w:val="0"/>
           <w:sz w:val="22"/>
         </w:rPr>
-        <w:t>25. Fancy, S. P. J. et al. (2011). Myelin regeneration: a review of the cellular and molecular mechanisms. Ann. Neurol. 69, 579–589. [DOI: pending]</w:t>
+        <w:t>27. Zawadzka, M. et al. (2010). CNS-resident glial progenitor/stem cells produce Schwann cells as well as oligodendrocytes during repair of CNS demyelination. Cell Stem Cell 6, 578–590. [DOI: 10.1016/j.stem.2010.04.002]</w:t>
       </w:r>
     </w:p>
     <w:p>
@@ -15301,7 +15301,7 @@
           <w:i w:val="0"/>
           <w:sz w:val="22"/>
         </w:rPr>
-        <w:t>Morgan, J. I., and Curran, T. (1991). Stimulus-transcription coupling in the nervous system: involvement of the inducible proto-oncogenes fos and jun. Annu. Rev. Neurosci. 14, 421–451. [DOI: 10.1146/annurev.neuro.14.1.421]</w:t>
+        <w:t>28. Doyle, K. P., Simon, R. P., and Stenzel-Poore, M. P. (2008). Mechanisms of ischemic brain damage and repair. Stroke 39, 571–578. [DOI: pending]</w:t>
       </w:r>
     </w:p>
     <w:p>
@@ -15315,7 +15315,7 @@
           <w:i w:val="0"/>
           <w:sz w:val="22"/>
         </w:rPr>
-        <w:t>Zawadzka, M. et al. (2010). CNS-resident glial progenitor/stem cells produce Schwann cells as well as oligodendrocytes during repair of CNS demyelination. Cell Stem Cell 6, 578–590. [DOI: 10.1016/j.stem.2010.04.002]</w:t>
+        <w:t>29. Jin, R., Yang, G., and Li, G. (2010). Inflammatory mechanisms in ischemic stroke. Prog. Neurobiol. 90, 178–189. [DOI: pending]</w:t>
       </w:r>
     </w:p>
     <w:p>
@@ -15329,7 +15329,7 @@
           <w:i w:val="0"/>
           <w:sz w:val="22"/>
         </w:rPr>
-        <w:t>28. Doyle, K. P., Simon, R. P., and Stenzel-Poore, M. P. (2008). Mechanisms of ischemic brain damage and repair. Stroke 39, 571–578. [DOI: pending]</w:t>
+        <w:t>30. Barr, T. L. et al. (2010). Genomic expression in acute stroke patients. Stroke 41, 2280–2285. [DOI: pending]</w:t>
       </w:r>
     </w:p>
     <w:p>
@@ -15343,7 +15343,7 @@
           <w:i w:val="0"/>
           <w:sz w:val="22"/>
         </w:rPr>
-        <w:t>29. Jin, R., Yang, G., and Li, G. (2010). Inflammatory mechanisms in ischemic stroke. Prog. Neurobiol. 90, 178–189. [DOI: pending]</w:t>
+        <w:t>31. Barbie, D. A. et al. (2009). Systematic RNA interference reveals that oncogenic KRAS-driven cancers require TBK1. Nature 462, 108–112. [DOI: 10.1038/nature08460]</w:t>
       </w:r>
     </w:p>
     <w:p>
@@ -15357,7 +15357,7 @@
           <w:i w:val="0"/>
           <w:sz w:val="22"/>
         </w:rPr>
-        <w:t>30. Barr, T. L. et al. (2010). Genomic expression in acute stroke patients. Stroke 41, 2280–2285. [DOI: pending]</w:t>
+        <w:t>32. Benjamini, Y., and Hochberg, Y. (1995). Controlling the false discovery rate: a practical and powerful approach to multiple testing. J. R. Stat. Soc. B 57, 289–300. [DOI: 10.1111/j.2517-6161.1995.tb02031.x]</w:t>
       </w:r>
     </w:p>
     <w:p>
@@ -15371,7 +15371,7 @@
           <w:i w:val="0"/>
           <w:sz w:val="22"/>
         </w:rPr>
-        <w:t>Barbie, D. A. et al. (2009). Systematic RNA interference reveals that oncogenic KRAS-driven cancers require TBK1. Nature 462, 108–112. [DOI: 10.1038/nature08460]</w:t>
+        <w:t>33. Jörg, L. M. et al. (2024). Transcription factors Sox8 and Sox10 contribute with different importance to the maintenance of mature oligodendrocytes. Int. J. Mol. Sci. 25, 8754. [DOI: 10.3390/ijms25168754]</w:t>
       </w:r>
     </w:p>
     <w:p>
@@ -15385,7 +15385,7 @@
           <w:i w:val="0"/>
           <w:sz w:val="22"/>
         </w:rPr>
-        <w:t>Benjamini, Y., and Hochberg, Y. (1995). Controlling the false discovery rate: a practical and powerful approach to multiple testing. J. R. Stat. Soc. B 57, 289–300. [DOI: 10.1111/j.2517-6161.1995.tb02031.x]</w:t>
+        <w:t>34. Lin, S.-Z. et al. (2025). C/EBPβ–VCAM1 axis in Kupffer cells promotes hepatic inflammation in MASLD. JHEP Rep. 7, 101418. [DOI: 10.1016/j.jhepr.2025.101418]</w:t>
       </w:r>
     </w:p>
     <w:p>
@@ -15399,7 +15399,7 @@
           <w:i w:val="0"/>
           <w:sz w:val="22"/>
         </w:rPr>
-        <w:t>Jörg, L. M. et al. (2024). Transcription factors Sox8 and Sox10 contribute with different importance to the maintenance of mature oligodendrocytes. Int. J. Mol. Sci. 25, 8754. [DOI: 10.3390/ijms25168754]</w:t>
+        <w:t>35. Subramanian, A. et al. (2017). A next generation connectivity map: L1000 platform and the first 1,000,000 profiles. Cell 171, 1437–1452.e17. [DOI: 10.1016/j.cell.2017.10.049]</w:t>
       </w:r>
     </w:p>
     <w:p>
@@ -15413,7 +15413,7 @@
           <w:i w:val="0"/>
           <w:sz w:val="22"/>
         </w:rPr>
-        <w:t>Lin, S.-Z. et al. (2025). C/EBPβ–VCAM1 axis in Kupffer cells promotes hepatic inflammation in MASLD. JHEP Rep. 7, 101418. [DOI: 10.1016/j.jhepr.2025.101418]</w:t>
+        <w:t>36. Replogle, J. M. et al. (2022). Mapping information-rich genotype–phenotype landscapes with genome-scale Perturb-seq. Cell 185, 2559–2575.e28. [DOI: 10.1016/j.cell.2022.05.013]</w:t>
       </w:r>
     </w:p>
     <w:p>
@@ -15427,7 +15427,7 @@
           <w:i w:val="0"/>
           <w:sz w:val="22"/>
         </w:rPr>
-        <w:t>Subramanian, A. et al. (2017). A next generation connectivity map: L1000 platform and the first 1,000,000 profiles. Cell 171, 1437–1452.e17. [DOI: 10.1016/j.cell.2017.10.049]</w:t>
+        <w:t>37. Veličković, P. (2023). Message passing all you need: graph attention networks and beyond. Nat. Rev. Phys. 5, 343–356. [DOI: pending]</w:t>
       </w:r>
     </w:p>
     <w:p>
@@ -15441,7 +15441,7 @@
           <w:i w:val="0"/>
           <w:sz w:val="22"/>
         </w:rPr>
-        <w:t>Replogle, J. M. et al. (2022). Mapping information-rich genotype–phenotype landscapes with genome-scale Perturb-seq. Cell 185, 2559–2575.e28. [DOI: 10.1016/j.cell.2022.05.013]</w:t>
+        <w:t>38. Zheng, X. et al. (2018). DAGs with NO TEARS: continuous optimization for structure learning. Proc. NeurIPS. [DOI: pending]</w:t>
       </w:r>
     </w:p>
     <w:p>
@@ -15455,7 +15455,7 @@
           <w:i w:val="0"/>
           <w:sz w:val="22"/>
         </w:rPr>
-        <w:t>37. Veličković, P. (2023). Message passing all you need: graph attention networks and beyond. Nat. Rev. Phys. 5, 343–356. [DOI: pending]</w:t>
+        <w:t>39. Lotfollahi, M. et al. (2023). Biologically informed deep learning for perturbation prediction and biological discovery. Nat. Biotechnol. 41, 1759–1770. [DOI: pending]</w:t>
       </w:r>
     </w:p>
     <w:p>
@@ -15469,7 +15469,7 @@
           <w:i w:val="0"/>
           <w:sz w:val="22"/>
         </w:rPr>
-        <w:t>38. Zheng, X. et al. (2018). DAGs with NO TEARS: continuous optimization for structure learning. Proc. NeurIPS. [DOI: pending]</w:t>
+        <w:t>40. Bereket, M., and Karaletsos, T. (2022). PerturbNet: a graph neural network for predicting perturbation outcomes. [bioRxiv]. [DOI: pending]</w:t>
       </w:r>
     </w:p>
     <w:p>
@@ -15483,7 +15483,7 @@
           <w:i w:val="0"/>
           <w:sz w:val="22"/>
         </w:rPr>
-        <w:t>39. Lotfollahi, M. et al. (2023). Biologically informed deep learning for perturbation prediction and biological discovery. Nat. Biotechnol. 41, 1759–1770. [DOI: pending]</w:t>
+        <w:t>41. Peidli, I. et al. (2024). scPerturb: harmonized single-cell perturbation data. Nature Methods 21, 531–540. [DOI: 10.1038/s41592-023-02144-y]</w:t>
       </w:r>
     </w:p>
     <w:p>
@@ -15497,7 +15497,7 @@
           <w:i w:val="0"/>
           <w:sz w:val="22"/>
         </w:rPr>
-        <w:t>40. Bereket, M., and Karaletsos, T. (2022). PerturbNet: a graph neural network for predicting perturbation outcomes. [bioRxiv]. [DOI: pending]</w:t>
+        <w:t>42. Singh, R. et al. (2024). PerturbExpress: a benchmarking platform for perturbation prediction. Nat. Microbiol. [DOI: pending]</w:t>
       </w:r>
     </w:p>
     <w:p>
@@ -15511,7 +15511,7 @@
           <w:i w:val="0"/>
           <w:sz w:val="22"/>
         </w:rPr>
-        <w:t>Peidli, I. et al. (2024). scPerturb: harmonized single-cell perturbation data. Nature Methods 21, 531–540. [DOI: 10.1038/s41592-023-02144-y]</w:t>
+        <w:t>43. Pratapa, A. et al. (2020). Benchmarking algorithms for gene regulatory network inference from single-cell transcriptomic data. Nat. Methods 17, 147–154. [DOI: 10.1038/s41592-019-0690-6]</w:t>
       </w:r>
     </w:p>
     <w:p>
@@ -15525,7 +15525,7 @@
           <w:i w:val="0"/>
           <w:sz w:val="22"/>
         </w:rPr>
-        <w:t>42. Singh, R. et al. (2024). PerturbExpress: a benchmarking platform for perturbation prediction. Nat. Microbiol. [DOI: pending]</w:t>
+        <w:t>44. Schraivogel, D. et al. (2022). Targeted Perturb-seq enables genome-scale identification of cellular regulators. Nat. Biotechnol. 40, 1370–1378. [DOI: pending]</w:t>
       </w:r>
     </w:p>
     <w:p>
@@ -15539,7 +15539,7 @@
           <w:i w:val="0"/>
           <w:sz w:val="22"/>
         </w:rPr>
-        <w:t>Pratapa, A. et al. (2020). Benchmarking algorithms for gene regulatory network inference from single-cell transcriptomic data. Nat. Methods 17, 147–154. [DOI: 10.1038/s41592-019-0690-6]</w:t>
+        <w:t>45. Adamson, B. et al. (2016). A multiplexed single-cell CRISPR screening platform enables systematic dissection of the unfolded protein response. Cell 167, 1867–1882.e21. [DOI: 10.1016/j.cell.2016.11.048]</w:t>
       </w:r>
     </w:p>
     <w:p>
@@ -15553,7 +15553,7 @@
           <w:i w:val="0"/>
           <w:sz w:val="22"/>
         </w:rPr>
-        <w:t>44. Schraivogel, D. et al. (2022). Targeted Perturb-seq enables genome-scale identification of cellular regulators. Nat. Biotechnol. 40, 1370–1378. [DOI: pending]</w:t>
+        <w:t>46. Dixit, A. et al. (2016). Perturb-Seq: dissecting molecular circuits with scalable single-cell RNA profiling of pooled genetic screens. Cell 167, 1853–1866.e17. [DOI: 10.1016/j.cell.2016.11.038]</w:t>
       </w:r>
     </w:p>
     <w:p>
@@ -15567,7 +15567,7 @@
           <w:i w:val="0"/>
           <w:sz w:val="22"/>
         </w:rPr>
-        <w:t>Adamson, B. et al. (2016). A multiplexed single-cell CRISPR screening platform enables systematic dissection of the unfolded protein response. Cell 167, 1867–1882.e21. [DOI: 10.1016/j.cell.2016.11.048]</w:t>
+        <w:t>47. Bhatt, D. L. et al. (2017). Statins in stroke prevention. Circulation 135, 1707–1720. [DOI: pending]</w:t>
       </w:r>
     </w:p>
     <w:p>
@@ -15581,7 +15581,7 @@
           <w:i w:val="0"/>
           <w:sz w:val="22"/>
         </w:rPr>
-        <w:t>Dixit, A. et al. (2016). Perturb-Seq: dissecting molecular circuits with scalable single-cell RNA profiling of pooled genetic screens. Cell 167, 1853–1866.e17. [DOI: 10.1016/j.cell.2016.11.038]</w:t>
+        <w:t>48. Li, Y. et al. (2020). HDAC inhibitors in neurological diseases. Nat. Rev. Drug Discov. 19, 341–359. [DOI: pending]</w:t>
       </w:r>
     </w:p>
     <w:p>
@@ -15595,7 +15595,7 @@
           <w:i w:val="0"/>
           <w:sz w:val="22"/>
         </w:rPr>
-        <w:t>47. Bhatt, D. L. et al. (2017). Statins in stroke prevention. Circulation 135, 1707–1720. [DOI: pending]</w:t>
+        <w:t>49. Ahlmann-Eltze, C. et al. (2025). Perturbation analysis in single-cell data: a comprehensive benchmark. Nat. Methods 22, 322–331. [DOI: pending]</w:t>
       </w:r>
     </w:p>
     <w:p>
@@ -15609,7 +15609,7 @@
           <w:i w:val="0"/>
           <w:sz w:val="22"/>
         </w:rPr>
-        <w:t>48. Li, Y. et al. (2020). HDAC inhibitors in neurological diseases. Nat. Rev. Drug Discov. 19, 341–359. [DOI: pending]</w:t>
+        <w:t>50. Kartha, V. K. et al. (2023). Functional inference of gene regulation using single-cell Perturb-seq. Nat. Genet. 55, 1339–1350. [DOI: pending]</w:t>
       </w:r>
     </w:p>
     <w:p>
@@ -15623,7 +15623,7 @@
           <w:i w:val="0"/>
           <w:sz w:val="22"/>
         </w:rPr>
-        <w:t>49. Ahlmann-Eltze, C. et al. (2025). Perturbation analysis in single-cell data: a comprehensive benchmark. Nat. Methods 22, 322–331. [DOI: pending]</w:t>
+        <w:t>51. Margolin, A. A. et al. (2006). ARACNE: an algorithm for the reconstruction of gene regulatory networks in a mammalian cellular context. BMC Bioinformatics 7, S7. [DOI: 10.1186/1471-2105-7-s1-s7]</w:t>
       </w:r>
     </w:p>
     <w:p>
@@ -15637,7 +15637,7 @@
           <w:i w:val="0"/>
           <w:sz w:val="22"/>
         </w:rPr>
-        <w:t>50. Kartha, V. K. et al. (2023). Functional inference of gene regulation using single-cell Perturb-seq. Nat. Genet. 55, 1339–1350. [DOI: pending]</w:t>
+        <w:t>52. Edelman, G. M., and Gally, J. A. (2001). Degeneracy and complexity in biological systems. Proc. Natl Acad. Sci. USA 98, 13763–13768. [DOI: 10.1073/pnas.231499798]</w:t>
       </w:r>
     </w:p>
     <w:p>
@@ -15651,7 +15651,7 @@
           <w:i w:val="0"/>
           <w:sz w:val="22"/>
         </w:rPr>
-        <w:t>Margolin, A. A. et al. (2006). ARACNE: an algorithm for the reconstruction of gene regulatory networks in a mammalian cellular context. BMC Bioinformatics 7, S7. [DOI: 10.1186/1471-2105-7-s1-s7]</w:t>
+        <w:t>53. Whitacre, J. M. (2010). Degeneracy: a link between evolvability, robustness and complexity in biological systems. Theor. Biol. Med. Model. 7, 6. [DOI: 10.1186/1742-4682-7-6]</w:t>
       </w:r>
     </w:p>
     <w:p>
@@ -15665,7 +15665,7 @@
           <w:i w:val="0"/>
           <w:sz w:val="22"/>
         </w:rPr>
-        <w:t>Edelman, G. M., and Gally, J. A. (2001). Degeneracy and complexity in biological systems. Proc. Natl Acad. Sci. USA 98, 13763–13768. [DOI: 10.1073/pnas.231499798]</w:t>
+        <w:t>54. Weider, M. et al. (2021). Nfat/calcineurin signaling promotes oligodendrocyte differentiation and myelination. Nat. Commun. 12, 4240. [DOI: pending]</w:t>
       </w:r>
     </w:p>
     <w:p>
@@ -15679,7 +15679,7 @@
           <w:i w:val="0"/>
           <w:sz w:val="22"/>
         </w:rPr>
-        <w:t>Whitacre, J. M. (2010). Degeneracy: a link between evolvability, robustness and complexity in biological systems. Theor. Biol. Med. Model. 7, 6. [DOI: 10.1186/1742-4682-7-6]</w:t>
+        <w:t>55. Huang, S. (2009). Reprogramming cell fates: reconciling rarity with robustness. BioEssays 31, 546–560. [DOI: 10.1002/bies.200800189]</w:t>
       </w:r>
     </w:p>
     <w:p>
@@ -15693,35 +15693,7 @@
           <w:i w:val="0"/>
           <w:sz w:val="22"/>
         </w:rPr>
-        <w:t>54. Weider, M. et al. (2021). Nfat/calcineurin signaling promotes oligodendrocyte differentiation and myelination. Nat. Commun. 12, 4240. [DOI: pending]</w:t>
-      </w:r>
-    </w:p>
-    <w:p>
-      <w:pPr>
-        <w:ind w:left="6" w:hanging="6"/>
-      </w:pPr>
-      <w:r>
-        <w:rPr>
-          <w:rFonts w:ascii="Times New Roman" w:hAnsi="Times New Roman"/>
-          <w:b w:val="0"/>
-          <w:i w:val="0"/>
-          <w:sz w:val="22"/>
-        </w:rPr>
-        <w:t>Huang, S. (2009). Reprogramming cell fates: reconciling rarity with robustness. BioEssays 31, 546–560. [DOI: 10.1002/bies.200800189]</w:t>
-      </w:r>
-    </w:p>
-    <w:p>
-      <w:pPr>
-        <w:ind w:left="6" w:hanging="6"/>
-      </w:pPr>
-      <w:r>
-        <w:rPr>
-          <w:rFonts w:ascii="Times New Roman" w:hAnsi="Times New Roman"/>
-          <w:b w:val="0"/>
-          <w:i w:val="0"/>
-          <w:sz w:val="22"/>
-        </w:rPr>
-        <w:t>Raj, A., and van Oudenaarden, A. (2008). Nature, nurture, or chance: stochastic gene expression and its consequences. Cell 135, 216–226. [DOI: 10.1016/j.cell.2008.09.050]</w:t>
+        <w:t>56. Raj, A., and van Oudenaarden, A. (2008). Nature, nurture, or chance: stochastic gene expression and its consequences. Cell 135, 216–226. [DOI: 10.1016/j.cell.2008.09.050]</w:t>
       </w:r>
     </w:p>
     <w:sectPr>

</xml_diff>

<commit_message>
Verify & fill 16/23 pending DOIs via PubMed+Crossref; correct wrong journal/vol/page/first-author metadata (Doyle, Jin, Barr, scGen, Schraivogel, Ahlmann-Eltze, Kartha, Weider, etc.); 7 refs flagged for author decision (suspected fabrication/author change)
</commit_message>
<xml_diff>
--- a/gate1/rewiring_study/manuscript_v6_humanized.docx
+++ b/gate1/rewiring_study/manuscript_v6_humanized.docx
@@ -14965,7 +14965,7 @@
           <w:i w:val="0"/>
           <w:sz w:val="22"/>
         </w:rPr>
-        <w:t>4. Anrather, J. et al. (2024). Single-cell RNA sequencing of the post-stroke brain and blood reveals a temporally coordinated immune response. Nat. Immunol. 25, 294–307. [DOI: pending]</w:t>
+        <w:t>4. Garcia-Bonilla, L. et al. (2024). Analysis of brain and blood single-cell transcriptomics in acute and subacute phases after experimental stroke. Nat. Immunol. 25, 357–370. [DOI: 10.1038/s41590-023-01711-x]</w:t>
       </w:r>
     </w:p>
     <w:p>
@@ -15119,7 +15119,7 @@
           <w:i w:val="0"/>
           <w:sz w:val="22"/>
         </w:rPr>
-        <w:t>15. Kipf, T. N., and Welling, M. (2017). Semi-supervised classification with graph convolutional networks. Proc. ICLR. [DOI: pending]</w:t>
+        <w:t>15. Kipf, T. N., and Welling, M. (2017). Semi-supervised classification with graph convolutional networks. Proc. ICLR. [DOI: 10.48550/arXiv.1609.02907]</w:t>
       </w:r>
     </w:p>
     <w:p>
@@ -15133,7 +15133,7 @@
           <w:i w:val="0"/>
           <w:sz w:val="22"/>
         </w:rPr>
-        <w:t>16. Veličković, P. et al. (2018). Graph attention networks. Proc. ICLR. [DOI: pending]</w:t>
+        <w:t>16. Veličković, P. et al. (2018). Graph attention networks. Proc. ICLR. [DOI: 10.48550/arXiv.1710.10903]</w:t>
       </w:r>
     </w:p>
     <w:p>
@@ -15147,7 +15147,7 @@
           <w:i w:val="0"/>
           <w:sz w:val="22"/>
         </w:rPr>
-        <w:t>17. Hamilton, W. L., Ying, Z., and Leskovec, J. (2017). Inductive representation learning on large graphs. Proc. NeurIPS. [DOI: pending]</w:t>
+        <w:t>17. Hamilton, W. L., Ying, Z., and Leskovec, J. (2017). Inductive representation learning on large graphs. Proc. NeurIPS. [DOI: 10.48550/arXiv.1706.02216]</w:t>
       </w:r>
     </w:p>
     <w:p>
@@ -15175,7 +15175,7 @@
           <w:i w:val="0"/>
           <w:sz w:val="22"/>
         </w:rPr>
-        <w:t>19. Lotfollahi, M. et al. (2019). Predicting cellular responses to perturbations with scGen. Nat. Methods 16, 1253–1261. [DOI: pending]</w:t>
+        <w:t>19. Lotfollahi, M., Wolf, F. A., and Theis, F. J. (2019). scGen predicts single-cell perturbation responses. Nat. Methods 16, 715–721. [DOI: 10.1038/s41592-019-0494-8]</w:t>
       </w:r>
     </w:p>
     <w:p>
@@ -15259,7 +15259,7 @@
           <w:i w:val="0"/>
           <w:sz w:val="22"/>
         </w:rPr>
-        <w:t>25. Fancy, S. P. J. et al. (2011). Myelin regeneration: a review of the cellular and molecular mechanisms. Ann. Neurol. 69, 579–589. [DOI: pending]</w:t>
+        <w:t>25. Fancy, S. P. J. et al. (2011). Myelin regeneration: a recapitulation of development? Annu. Rev. Neurosci. 34, 21–43. [DOI: 10.1146/annurev-neuro-061010-113629]</w:t>
       </w:r>
     </w:p>
     <w:p>
@@ -15301,7 +15301,7 @@
           <w:i w:val="0"/>
           <w:sz w:val="22"/>
         </w:rPr>
-        <w:t>28. Doyle, K. P., Simon, R. P., and Stenzel-Poore, M. P. (2008). Mechanisms of ischemic brain damage and repair. Stroke 39, 571–578. [DOI: pending]</w:t>
+        <w:t>28. Doyle, K. P., Simon, R. P., and Stenzel-Poore, M. P. (2008). Mechanisms of ischemic brain damage. Neuropharmacology 55, 310–318. [DOI: 10.1016/j.neuropharm.2008.01.005]</w:t>
       </w:r>
     </w:p>
     <w:p>
@@ -15315,7 +15315,7 @@
           <w:i w:val="0"/>
           <w:sz w:val="22"/>
         </w:rPr>
-        <w:t>29. Jin, R., Yang, G., and Li, G. (2010). Inflammatory mechanisms in ischemic stroke. Prog. Neurobiol. 90, 178–189. [DOI: pending]</w:t>
+        <w:t>29. Jin, R., Yang, G., and Li, G. (2010). Inflammatory mechanisms in ischemic stroke: role of inflammatory cells. J. Leukoc. Biol. 87, 779–789. [DOI: 10.1189/jlb.1109766]</w:t>
       </w:r>
     </w:p>
     <w:p>
@@ -15329,7 +15329,7 @@
           <w:i w:val="0"/>
           <w:sz w:val="22"/>
         </w:rPr>
-        <w:t>30. Barr, T. L. et al. (2010). Genomic expression in acute stroke patients. Stroke 41, 2280–2285. [DOI: pending]</w:t>
+        <w:t>30. Barr, T. L. et al. (2010). Genomic biomarkers and cellular pathways of ischemic stroke by RNA gene expression profiling. Neurology 75, 1009–1014. [DOI: 10.1212/wnl.0b013e3181f2b37f]</w:t>
       </w:r>
     </w:p>
     <w:p>
@@ -15427,7 +15427,7 @@
           <w:i w:val="0"/>
           <w:sz w:val="22"/>
         </w:rPr>
-        <w:t>37. Veličković, P. (2023). Message passing all you need: graph attention networks and beyond. Nat. Rev. Phys. 5, 343–356. [DOI: pending]</w:t>
+        <w:t>37. Veličković, P. (2023). Everything is connected: graph neural networks. Curr. Opin. Struct. Biol. 79, 102538. [DOI: 10.1016/j.sbi.2023.102538]</w:t>
       </w:r>
     </w:p>
     <w:p>
@@ -15441,7 +15441,7 @@
           <w:i w:val="0"/>
           <w:sz w:val="22"/>
         </w:rPr>
-        <w:t>38. Zheng, X. et al. (2018). DAGs with NO TEARS: continuous optimization for structure learning. Proc. NeurIPS. [DOI: pending]</w:t>
+        <w:t>38. Zheng, X. et al. (2018). DAGs with NO TEARS: continuous optimization for structure learning. Proc. NeurIPS. [DOI: 10.48550/arXiv.1803.01422]</w:t>
       </w:r>
     </w:p>
     <w:p>
@@ -15455,7 +15455,7 @@
           <w:i w:val="0"/>
           <w:sz w:val="22"/>
         </w:rPr>
-        <w:t>39. Lotfollahi, M. et al. (2023). Biologically informed deep learning for perturbation prediction and biological discovery. Nat. Biotechnol. 41, 1759–1770. [DOI: pending]</w:t>
+        <w:t>39. Lotfollahi, M. et al. (2023). Biologically informed deep learning to query gene programs in single-cell atlases. Nat. Cell Biol. 25, 337–350. [DOI: 10.1038/s41556-022-01072-x]</w:t>
       </w:r>
     </w:p>
     <w:p>
@@ -15525,7 +15525,7 @@
           <w:i w:val="0"/>
           <w:sz w:val="22"/>
         </w:rPr>
-        <w:t>44. Schraivogel, D. et al. (2022). Targeted Perturb-seq enables genome-scale identification of cellular regulators. Nat. Biotechnol. 40, 1370–1378. [DOI: pending]</w:t>
+        <w:t>44. Schraivogel, D. et al. (2020). Targeted Perturb-seq enables genome-scale genetic screens in single cells. Nat. Methods 17, 629–635. [DOI: 10.1038/s41592-020-0837-5]</w:t>
       </w:r>
     </w:p>
     <w:p>
@@ -15595,7 +15595,7 @@
           <w:i w:val="0"/>
           <w:sz w:val="22"/>
         </w:rPr>
-        <w:t>49. Ahlmann-Eltze, C. et al. (2025). Perturbation analysis in single-cell data: a comprehensive benchmark. Nat. Methods 22, 322–331. [DOI: pending]</w:t>
+        <w:t>49. Ahlmann-Eltze, C., Huber, W., and Anders, S. (2025). Deep-learning-based gene perturbation effect prediction does not yet outperform simple linear baselines. Nat. Methods 22, 1657–1661. [DOI: 10.1038/s41592-025-02772-6]</w:t>
       </w:r>
     </w:p>
     <w:p>
@@ -15609,7 +15609,7 @@
           <w:i w:val="0"/>
           <w:sz w:val="22"/>
         </w:rPr>
-        <w:t>50. Kartha, V. K. et al. (2023). Functional inference of gene regulation using single-cell Perturb-seq. Nat. Genet. 55, 1339–1350. [DOI: pending]</w:t>
+        <w:t>50. Kartha, V. K. et al. (2022). Functional inference of gene regulation using single-cell multi-omics. Cell Genom. 2, 100166. [DOI: 10.1016/j.xgen.2022.100166]</w:t>
       </w:r>
     </w:p>
     <w:p>
@@ -15665,7 +15665,7 @@
           <w:i w:val="0"/>
           <w:sz w:val="22"/>
         </w:rPr>
-        <w:t>54. Weider, M. et al. (2021). Nfat/calcineurin signaling promotes oligodendrocyte differentiation and myelination. Nat. Commun. 12, 4240. [DOI: pending]</w:t>
+        <w:t>54. Weider, M. et al. (2018). Nfat/calcineurin signaling promotes oligodendrocyte differentiation and myelination by transcription factor network tuning. Nat. Commun. 9, 899. [DOI: 10.1038/s41467-018-03336-3]</w:t>
       </w:r>
     </w:p>
     <w:p>

</xml_diff>